<commit_message>
Day17-AgentFramework: guard agent-invocation loop against failure, add project.md
The await foreach over travelAgent.InvokeAsync was unguarded - a rate
limit, network blip, or bad key would crash the whole console session.
Wraps it in try/catch so a failed turn can be retried. Syncs the
docx's Complete Code listing and replaces missing.md with project.md.
</commit_message>
<xml_diff>
--- a/Day17-AgentFramework.docx
+++ b/Day17-AgentFramework.docx
@@ -1081,7 +1081,7 @@
           <w:rFonts w:ascii="Consolas" w:hAnsi="Consolas"/>
           <w:sz w:val="19"/>
         </w:rPr>
-        <w:t xml:space="preserve">                await foreach (var message in travelAgent.InvokeAsync(chatHistory))</w:t>
+        <w:t xml:space="preserve">                try</w:t>
       </w:r>
     </w:p>
     <w:p>
@@ -1113,48 +1113,97 @@
           <w:rFonts w:ascii="Consolas" w:hAnsi="Consolas"/>
           <w:sz w:val="19"/>
         </w:rPr>
-        <w:t xml:space="preserve">                    Console.WriteLine($"\n{message.Message.AuthorName}: {message.Message.Content}");</w:t>
-      </w:r>
-    </w:p>
-    <w:p>
-      <w:pPr>
-        <w:pStyle w:val="NoSpacing"/>
-        <w:rPr>
-          <w:rFonts w:ascii="Consolas" w:hAnsi="Consolas"/>
-          <w:sz w:val="19"/>
-        </w:rPr>
-      </w:pPr>
-    </w:p>
-    <w:p>
-      <w:pPr>
-        <w:pStyle w:val="NoSpacing"/>
-        <w:rPr>
-          <w:rFonts w:ascii="Consolas" w:hAnsi="Consolas"/>
-          <w:sz w:val="19"/>
-        </w:rPr>
-      </w:pPr>
-      <w:r>
-        <w:rPr>
-          <w:rFonts w:ascii="Consolas" w:hAnsi="Consolas"/>
-          <w:sz w:val="19"/>
-        </w:rPr>
-        <w:t xml:space="preserve">                    // Add the agent's response to the history to maintain context</w:t>
-      </w:r>
-    </w:p>
-    <w:p>
-      <w:pPr>
-        <w:pStyle w:val="NoSpacing"/>
-        <w:rPr>
-          <w:rFonts w:ascii="Consolas" w:hAnsi="Consolas"/>
-          <w:sz w:val="19"/>
-        </w:rPr>
-      </w:pPr>
-      <w:r>
-        <w:rPr>
-          <w:rFonts w:ascii="Consolas" w:hAnsi="Consolas"/>
-          <w:sz w:val="19"/>
-        </w:rPr>
-        <w:t xml:space="preserve">                    chatHistory.Add(message);</w:t>
+        <w:t xml:space="preserve">                    await foreach (var message in travelAgent.InvokeAsync(chatHistory))</w:t>
+      </w:r>
+    </w:p>
+    <w:p>
+      <w:pPr>
+        <w:pStyle w:val="NoSpacing"/>
+        <w:rPr>
+          <w:rFonts w:ascii="Consolas" w:hAnsi="Consolas"/>
+          <w:sz w:val="19"/>
+        </w:rPr>
+      </w:pPr>
+      <w:r>
+        <w:rPr>
+          <w:rFonts w:ascii="Consolas" w:hAnsi="Consolas"/>
+          <w:sz w:val="19"/>
+        </w:rPr>
+        <w:t xml:space="preserve">                    {</w:t>
+      </w:r>
+    </w:p>
+    <w:p>
+      <w:pPr>
+        <w:pStyle w:val="NoSpacing"/>
+        <w:rPr>
+          <w:rFonts w:ascii="Consolas" w:hAnsi="Consolas"/>
+          <w:sz w:val="19"/>
+        </w:rPr>
+      </w:pPr>
+      <w:r>
+        <w:rPr>
+          <w:rFonts w:ascii="Consolas" w:hAnsi="Consolas"/>
+          <w:sz w:val="19"/>
+        </w:rPr>
+        <w:t xml:space="preserve">                        Console.WriteLine($"\n{message.Message.AuthorName}: {message.Message.Content}");</w:t>
+      </w:r>
+    </w:p>
+    <w:p>
+      <w:pPr>
+        <w:pStyle w:val="NoSpacing"/>
+        <w:rPr>
+          <w:rFonts w:ascii="Consolas" w:hAnsi="Consolas"/>
+          <w:sz w:val="19"/>
+        </w:rPr>
+      </w:pPr>
+    </w:p>
+    <w:p>
+      <w:pPr>
+        <w:pStyle w:val="NoSpacing"/>
+        <w:rPr>
+          <w:rFonts w:ascii="Consolas" w:hAnsi="Consolas"/>
+          <w:sz w:val="19"/>
+        </w:rPr>
+      </w:pPr>
+      <w:r>
+        <w:rPr>
+          <w:rFonts w:ascii="Consolas" w:hAnsi="Consolas"/>
+          <w:sz w:val="19"/>
+        </w:rPr>
+        <w:t xml:space="preserve">                        // Add the agent's response to the history to maintain context</w:t>
+      </w:r>
+    </w:p>
+    <w:p>
+      <w:pPr>
+        <w:pStyle w:val="NoSpacing"/>
+        <w:rPr>
+          <w:rFonts w:ascii="Consolas" w:hAnsi="Consolas"/>
+          <w:sz w:val="19"/>
+        </w:rPr>
+      </w:pPr>
+      <w:r>
+        <w:rPr>
+          <w:rFonts w:ascii="Consolas" w:hAnsi="Consolas"/>
+          <w:sz w:val="19"/>
+        </w:rPr>
+        <w:t xml:space="preserve">                        chatHistory.Add(message);</w:t>
+      </w:r>
+    </w:p>
+    <w:p>
+      <w:pPr>
+        <w:pStyle w:val="NoSpacing"/>
+        <w:rPr>
+          <w:rFonts w:ascii="Consolas" w:hAnsi="Consolas"/>
+          <w:sz w:val="19"/>
+        </w:rPr>
+      </w:pPr>
+      <w:r>
+        <w:rPr>
+          <w:rFonts w:ascii="Consolas" w:hAnsi="Consolas"/>
+          <w:sz w:val="19"/>
+        </w:rPr>
+        <w:lastRenderedPageBreak/>
+        <w:t xml:space="preserve">                    }</w:t>
       </w:r>
     </w:p>
     <w:p>
@@ -1186,6 +1235,118 @@
           <w:rFonts w:ascii="Consolas" w:hAnsi="Consolas"/>
           <w:sz w:val="19"/>
         </w:rPr>
+        <w:t xml:space="preserve">                catch (Exception ex)</w:t>
+      </w:r>
+    </w:p>
+    <w:p>
+      <w:pPr>
+        <w:pStyle w:val="NoSpacing"/>
+        <w:rPr>
+          <w:rFonts w:ascii="Consolas" w:hAnsi="Consolas"/>
+          <w:sz w:val="19"/>
+        </w:rPr>
+      </w:pPr>
+      <w:r>
+        <w:rPr>
+          <w:rFonts w:ascii="Consolas" w:hAnsi="Consolas"/>
+          <w:sz w:val="19"/>
+        </w:rPr>
+        <w:t xml:space="preserve">                {</w:t>
+      </w:r>
+    </w:p>
+    <w:p>
+      <w:pPr>
+        <w:pStyle w:val="NoSpacing"/>
+        <w:rPr>
+          <w:rFonts w:ascii="Consolas" w:hAnsi="Consolas"/>
+          <w:sz w:val="19"/>
+        </w:rPr>
+      </w:pPr>
+      <w:r>
+        <w:rPr>
+          <w:rFonts w:ascii="Consolas" w:hAnsi="Consolas"/>
+          <w:sz w:val="19"/>
+        </w:rPr>
+        <w:t xml:space="preserve">                    // 5. A failed call (rate limit, network blip, bad key) would otherwise</w:t>
+      </w:r>
+    </w:p>
+    <w:p>
+      <w:pPr>
+        <w:pStyle w:val="NoSpacing"/>
+        <w:rPr>
+          <w:rFonts w:ascii="Consolas" w:hAnsi="Consolas"/>
+          <w:sz w:val="19"/>
+        </w:rPr>
+      </w:pPr>
+      <w:r>
+        <w:rPr>
+          <w:rFonts w:ascii="Consolas" w:hAnsi="Consolas"/>
+          <w:sz w:val="19"/>
+        </w:rPr>
+        <w:t xml:space="preserve">                    // throw out of the await foreach and crash the whole console session.</w:t>
+      </w:r>
+    </w:p>
+    <w:p>
+      <w:pPr>
+        <w:pStyle w:val="NoSpacing"/>
+        <w:rPr>
+          <w:rFonts w:ascii="Consolas" w:hAnsi="Consolas"/>
+          <w:sz w:val="19"/>
+        </w:rPr>
+      </w:pPr>
+      <w:r>
+        <w:rPr>
+          <w:rFonts w:ascii="Consolas" w:hAnsi="Consolas"/>
+          <w:sz w:val="19"/>
+        </w:rPr>
+        <w:t xml:space="preserve">                    // Report the error and let the user try again instead of losing the chat.</w:t>
+      </w:r>
+    </w:p>
+    <w:p>
+      <w:pPr>
+        <w:pStyle w:val="NoSpacing"/>
+        <w:rPr>
+          <w:rFonts w:ascii="Consolas" w:hAnsi="Consolas"/>
+          <w:sz w:val="19"/>
+        </w:rPr>
+      </w:pPr>
+      <w:r>
+        <w:rPr>
+          <w:rFonts w:ascii="Consolas" w:hAnsi="Consolas"/>
+          <w:sz w:val="19"/>
+        </w:rPr>
+        <w:t xml:space="preserve">                    Console.WriteLine($"\n[Error] The agent could not complete this turn: {ex.Message}");</w:t>
+      </w:r>
+    </w:p>
+    <w:p>
+      <w:pPr>
+        <w:pStyle w:val="NoSpacing"/>
+        <w:rPr>
+          <w:rFonts w:ascii="Consolas" w:hAnsi="Consolas"/>
+          <w:sz w:val="19"/>
+        </w:rPr>
+      </w:pPr>
+      <w:r>
+        <w:rPr>
+          <w:rFonts w:ascii="Consolas" w:hAnsi="Consolas"/>
+          <w:sz w:val="19"/>
+        </w:rPr>
+        <w:t xml:space="preserve">                }</w:t>
+      </w:r>
+    </w:p>
+    <w:p>
+      <w:pPr>
+        <w:pStyle w:val="NoSpacing"/>
+        <w:rPr>
+          <w:rFonts w:ascii="Consolas" w:hAnsi="Consolas"/>
+          <w:sz w:val="19"/>
+        </w:rPr>
+      </w:pPr>
+      <w:r>
+        <w:rPr>
+          <w:rFonts w:ascii="Consolas" w:hAnsi="Consolas"/>
+          <w:sz w:val="19"/>
+        </w:rPr>
         <w:t xml:space="preserve">            }</w:t>
       </w:r>
     </w:p>
@@ -1296,6 +1457,7 @@
         <w:rPr>
           <w:b/>
         </w:rPr>
+        <w:lastRenderedPageBreak/>
         <w:t>Step 4: `InvokeAsync` Returns a Stream of Messages.</w:t>
       </w:r>
       <w:r>
@@ -1530,6 +1692,7 @@
           <w:rFonts w:ascii="Consolas" w:hAnsi="Consolas"/>
           <w:sz w:val="19"/>
         </w:rPr>
+        <w:lastRenderedPageBreak/>
         <w:t>--- AGENT IS THINKING ---</w:t>
       </w:r>
     </w:p>

</xml_diff>